<commit_message>
Article: rebuild review packet (5 docs) from corrected sources after provenance pass
01-Article (review-ready reframe + §IX vault-cost; 195 real footnotes, 0 telemetry leaks), 02-Reviewer-Memo (provenance bullet + confirm-two-facts), 03-Appendices (App E vault-only), 00-START-HERE (5-doc + 2-facts), 04-companion unchanged; zip rebuilt.
</commit_message>
<xml_diff>
--- a/Chandler Constitutional Law Vault/Article/packet-2026-05-30/00-START-HERE.docx
+++ b/Chandler Constitutional Law Vault/Article/packet-2026-05-30/00-START-HERE.docx
@@ -113,7 +113,7 @@
         <w:t xml:space="preserve">Journal of Legal Education</w:t>
       </w:r>
       <w:r>
-        <w:t xml:space="preserve">, together with the supporting exhibits a reviewer would want. It describes how your Constitutional Law I archive was converted, under human-reviewed AI assistance, into a navigable, source-verified, student-facing course-knowledge system, and argues that the</w:t>
+        <w:t xml:space="preserve">, with the supporting exhibits a reviewer would want. It describes how your Constitutional Law I archive was converted, under human-reviewed AI assistance, into a navigable, source-verified, student-facing course-knowledge system, and argues that the</w:t>
       </w:r>
       <w:r>
         <w:t xml:space="preserve"> </w:t>
@@ -209,7 +209,7 @@
               <w:pStyle w:val="Compact"/>
             </w:pPr>
             <w:r>
-              <w:t xml:space="preserve">One-page orientation and the decisions I need from you</w:t>
+              <w:t xml:space="preserve">One-page orientation and what I need from you</w:t>
             </w:r>
           </w:p>
         </w:tc>
@@ -237,7 +237,7 @@
               <w:pStyle w:val="Compact"/>
             </w:pPr>
             <w:r>
-              <w:t xml:space="preserve">The full article — ~14,100 words, 14 sections, real footnotes (Bluebook 21st)</w:t>
+              <w:t xml:space="preserve">The full article — ~14,600 words, 14 sections, real footnotes (Bluebook 21st)</w:t>
             </w:r>
           </w:p>
         </w:tc>
@@ -293,7 +293,58 @@
               <w:pStyle w:val="Compact"/>
             </w:pPr>
             <w:r>
-              <w:t xml:space="preserve">Supporting exhibits A–F (input inventory, AI tooling, templates, rubric, cost log, technical setup)</w:t>
+              <w:t xml:space="preserve">Supporting exhibits A–F (input inventory, AI tooling, templates, rubric,</w:t>
+            </w:r>
+            <w:r>
+              <w:t xml:space="preserve"> </w:t>
+            </w:r>
+            <w:r>
+              <w:rPr>
+                <w:b/>
+                <w:bCs/>
+              </w:rPr>
+              <w:t xml:space="preserve">cost log</w:t>
+            </w:r>
+            <w:r>
+              <w:t xml:space="preserve">, technical setup)</w:t>
+            </w:r>
+          </w:p>
+        </w:tc>
+      </w:tr>
+      <w:tr>
+        <w:tc>
+          <w:tcPr/>
+          <w:p>
+            <w:pPr>
+              <w:pStyle w:val="Compact"/>
+            </w:pPr>
+            <w:r>
+              <w:rPr>
+                <w:b/>
+                <w:bCs/>
+              </w:rPr>
+              <w:t xml:space="preserve">04-How-This-Article-Was-Written.docx</w:t>
+            </w:r>
+          </w:p>
+        </w:tc>
+        <w:tc>
+          <w:tcPr/>
+          <w:p>
+            <w:pPr>
+              <w:pStyle w:val="Compact"/>
+            </w:pPr>
+            <w:r>
+              <w:rPr>
+                <w:i/>
+                <w:iCs/>
+              </w:rPr>
+              <w:t xml:space="preserve">Optional.</w:t>
+            </w:r>
+            <w:r>
+              <w:t xml:space="preserve"> </w:t>
+            </w:r>
+            <w:r>
+              <w:t xml:space="preserve">How the paper itself was drafted by an autonomous loop — behind-the-scenes, not part of the article</w:t>
             </w:r>
           </w:p>
         </w:tc>
@@ -314,7 +365,7 @@
         <w:t xml:space="preserve"> </w:t>
       </w:r>
       <w:r>
-        <w:t xml:space="preserve">skim this page, read the Reviewer-Memo (§§1–4), then the Article. The Appendices are reference exhibits — dip in as needed.</w:t>
+        <w:t xml:space="preserve">skim this page, read the Reviewer-Memo (§§1–4), then the Article. Appendices and the companion note are reference reading.</w:t>
       </w:r>
     </w:p>
     <w:bookmarkEnd w:id="10"/>
@@ -362,13 +413,13 @@
           <w:b/>
           <w:bCs/>
         </w:rPr>
-        <w:t xml:space="preserve">Make the four calls only you can make</w:t>
-      </w:r>
-      <w:r>
-        <w:t xml:space="preserve"> </w:t>
-      </w:r>
-      <w:r>
-        <w:t xml:space="preserve">(the system deliberately did not answer these):</w:t>
+        <w:t xml:space="preserve">Confirm two facts about the course</w:t>
+      </w:r>
+      <w:r>
+        <w:t xml:space="preserve"> </w:t>
+      </w:r>
+      <w:r>
+        <w:t xml:space="preserve">(the draft states them on the author’s understanding):</w:t>
       </w:r>
     </w:p>
     <w:p>
@@ -384,13 +435,29 @@
           <w:b/>
           <w:bCs/>
         </w:rPr>
-        <w:t xml:space="preserve">Casebook ingestion</w:t>
-      </w:r>
-      <w:r>
-        <w:t xml:space="preserve"> </w:t>
-      </w:r>
-      <w:r>
-        <w:t xml:space="preserve">— were casebook excerpts ingested into the corpus?</w:t>
+        <w:t xml:space="preserve">Casebook:</w:t>
+      </w:r>
+      <w:r>
+        <w:t xml:space="preserve"> </w:t>
+      </w:r>
+      <w:r>
+        <w:t xml:space="preserve">the corpus is your own course materials, with</w:t>
+      </w:r>
+      <w:r>
+        <w:t xml:space="preserve"> </w:t>
+      </w:r>
+      <w:r>
+        <w:rPr>
+          <w:b/>
+          <w:bCs/>
+        </w:rPr>
+        <w:t xml:space="preserve">no casebook excerpts</w:t>
+      </w:r>
+      <w:r>
+        <w:t xml:space="preserve"> </w:t>
+      </w:r>
+      <w:r>
+        <w:t xml:space="preserve">ingested — correct?</w:t>
       </w:r>
     </w:p>
     <w:p>
@@ -406,35 +473,29 @@
           <w:b/>
           <w:bCs/>
         </w:rPr>
-        <w:t xml:space="preserve">Student-work ingestion</w:t>
-      </w:r>
-      <w:r>
-        <w:t xml:space="preserve"> </w:t>
-      </w:r>
-      <w:r>
-        <w:t xml:space="preserve">— was any student work ingested? (affects the §XII.D privacy framing)</w:t>
-      </w:r>
-    </w:p>
-    <w:p>
-      <w:pPr>
-        <w:pStyle w:val="Compact"/>
-        <w:numPr>
-          <w:ilvl w:val="1"/>
-          <w:numId w:val="1002"/>
-        </w:numPr>
-      </w:pPr>
+        <w:t xml:space="preserve">Review coverage:</w:t>
+      </w:r>
+      <w:r>
+        <w:t xml:space="preserve"> </w:t>
+      </w:r>
+      <w:r>
+        <w:t xml:space="preserve">the pages shipped</w:t>
+      </w:r>
+      <w:r>
+        <w:t xml:space="preserve"> </w:t>
+      </w:r>
       <w:r>
         <w:rPr>
           <w:b/>
           <w:bCs/>
         </w:rPr>
-        <w:t xml:space="preserve">Review coverage</w:t>
-      </w:r>
-      <w:r>
-        <w:t xml:space="preserve"> </w:t>
-      </w:r>
-      <w:r>
-        <w:t xml:space="preserve">— were</w:t>
+        <w:t xml:space="preserve">review-ready but were not individually professor-reviewed before going live</w:t>
+      </w:r>
+      <w:r>
+        <w:t xml:space="preserve"> </w:t>
+      </w:r>
+      <w:r>
+        <w:t xml:space="preserve">— is that the right characterization? (If any or all</w:t>
       </w:r>
       <w:r>
         <w:t xml:space="preserve"> </w:t>
@@ -444,47 +505,13 @@
           <w:i/>
           <w:iCs/>
         </w:rPr>
-        <w:t xml:space="preserve">all</w:t>
-      </w:r>
-      <w:r>
-        <w:t xml:space="preserve"> </w:t>
-      </w:r>
-      <w:r>
-        <w:t xml:space="preserve">of the 198 snapshot-date pages professor-reviewed before they went live? (the</w:t>
-      </w:r>
-      <w:r>
-        <w:t xml:space="preserve"> </w:t>
-      </w:r>
-      <w:r>
-        <w:t xml:space="preserve">“reviewed static site”</w:t>
-      </w:r>
-      <w:r>
-        <w:t xml:space="preserve"> </w:t>
-      </w:r>
-      <w:r>
-        <w:t xml:space="preserve">claim rests on this)</w:t>
-      </w:r>
-    </w:p>
-    <w:p>
-      <w:pPr>
-        <w:pStyle w:val="Compact"/>
-        <w:numPr>
-          <w:ilvl w:val="1"/>
-          <w:numId w:val="1002"/>
-        </w:numPr>
-      </w:pPr>
-      <w:r>
-        <w:rPr>
-          <w:b/>
-          <w:bCs/>
-        </w:rPr>
-        <w:t xml:space="preserve">Second instance (§X.E)</w:t>
-      </w:r>
-      <w:r>
-        <w:t xml:space="preserve"> </w:t>
-      </w:r>
-      <w:r>
-        <w:t xml:space="preserve">— if you have a course in mind for a second build (Torts? Contracts?), naming it strengthens the article’s invitation.</w:t>
+        <w:t xml:space="preserve">were</w:t>
+      </w:r>
+      <w:r>
+        <w:t xml:space="preserve"> </w:t>
+      </w:r>
+      <w:r>
+        <w:t xml:space="preserve">reviewed, tell us and we’ll say so.)</w:t>
       </w:r>
     </w:p>
     <w:p>
@@ -500,13 +527,35 @@
           <w:b/>
           <w:bCs/>
         </w:rPr>
+        <w:t xml:space="preserve">One open invitation (§X.E):</w:t>
+      </w:r>
+      <w:r>
+        <w:t xml:space="preserve"> </w:t>
+      </w:r>
+      <w:r>
+        <w:t xml:space="preserve">if you have a course in mind for a second build (Torts? Contracts?), naming it strengthens the article.</w:t>
+      </w:r>
+    </w:p>
+    <w:p>
+      <w:pPr>
+        <w:pStyle w:val="Compact"/>
+        <w:numPr>
+          <w:ilvl w:val="0"/>
+          <w:numId w:val="1001"/>
+        </w:numPr>
+      </w:pPr>
+      <w:r>
+        <w:rPr>
+          <w:b/>
+          <w:bCs/>
+        </w:rPr>
         <w:t xml:space="preserve">Note the page-proof items</w:t>
       </w:r>
       <w:r>
         <w:t xml:space="preserve"> </w:t>
       </w:r>
       <w:r>
-        <w:t xml:space="preserve">flagged in Reviewer-Memo §4.2 (a few edited-volume page pins, and one cited study that PNAS later corrected).</w:t>
+        <w:t xml:space="preserve">in the Reviewer-Memo (a few edited-volume page pins; one cited study PNAS later corrected).</w:t>
       </w:r>
     </w:p>
     <w:bookmarkEnd w:id="11"/>
@@ -524,7 +573,39 @@
         <w:pStyle w:val="FirstParagraph"/>
       </w:pPr>
       <w:r>
-        <w:t xml:space="preserve">Constitutional-law doctrine independently audited clean (0 stale holdings); citations checked for both liveness and actual support; the literature is anchored in the legal-education canon, not just AI/CS sources; ~14,100 words; 190 contiguous footnotes; figures still need format conversion before any submission.</w:t>
+        <w:t xml:space="preserve">Constitutional-law doctrine independently audited clean (0 stale holdings); citations checked for liveness</w:t>
+      </w:r>
+      <w:r>
+        <w:t xml:space="preserve"> </w:t>
+      </w:r>
+      <w:r>
+        <w:rPr>
+          <w:i/>
+          <w:iCs/>
+        </w:rPr>
+        <w:t xml:space="preserve">and</w:t>
+      </w:r>
+      <w:r>
+        <w:t xml:space="preserve"> </w:t>
+      </w:r>
+      <w:r>
+        <w:t xml:space="preserve">support; literature anchored in the legal-education canon;</w:t>
+      </w:r>
+      <w:r>
+        <w:t xml:space="preserve"> </w:t>
+      </w:r>
+      <w:r>
+        <w:rPr>
+          <w:b/>
+          <w:bCs/>
+        </w:rPr>
+        <w:t xml:space="preserve">§IX now reports the cost of building the vault</w:t>
+      </w:r>
+      <w:r>
+        <w:t xml:space="preserve"> </w:t>
+      </w:r>
+      <w:r>
+        <w:t xml:space="preserve">(255 automated runs over ~3 weeks, eight-phase rotation, 198-page deliverable — no dollar/hours figure claimed because per-run cost was never metered); ~14,600 words (a short trim brings it under JLE’s 14,000 ceiling); figures still need format conversion before any submission.</w:t>
       </w:r>
     </w:p>
     <w:bookmarkEnd w:id="12"/>
@@ -572,7 +653,7 @@
         <w:t xml:space="preserve"> </w:t>
       </w:r>
       <w:r>
-        <w:t xml:space="preserve">short-form. The citations themselves are correct; the short-form pass is a copy-edit/production step, not a substantive fix.</w:t>
+        <w:t xml:space="preserve">short-form. The citations are correct; the short-form pass is a copy-edit step.</w:t>
       </w:r>
     </w:p>
     <w:p>
@@ -594,38 +675,10 @@
         <w:t xml:space="preserve"> </w:t>
       </w:r>
       <w:r>
-        <w:t xml:space="preserve">The article references figures that still need conversion to JLE’s format (≥300 dpi, separate files) before any submission.</w:t>
+        <w:t xml:space="preserve">The article references figures that still need conversion to JLE’s format (≥300 dpi, separate files) before submission.</w:t>
       </w:r>
     </w:p>
     <w:bookmarkEnd w:id="13"/>
-    <w:bookmarkStart w:id="14" w:name="important"/>
-    <w:p>
-      <w:pPr>
-        <w:pStyle w:val="Heading2"/>
-      </w:pPr>
-      <w:r>
-        <w:t xml:space="preserve">Important</w:t>
-      </w:r>
-    </w:p>
-    <w:p>
-      <w:pPr>
-        <w:pStyle w:val="FirstParagraph"/>
-      </w:pPr>
-      <w:r>
-        <w:rPr>
-          <w:b/>
-          <w:bCs/>
-        </w:rPr>
-        <w:t xml:space="preserve">The system did not submit this article to the Journal of Legal Education, and it did not email you.</w:t>
-      </w:r>
-      <w:r>
-        <w:t xml:space="preserve"> </w:t>
-      </w:r>
-      <w:r>
-        <w:t xml:space="preserve">Submitting and contacting you are decisions reserved for you and the author. This packet is for your review only.</w:t>
-      </w:r>
-    </w:p>
-    <w:bookmarkEnd w:id="14"/>
     <w:sectPr>
       <w:footnotePr>
         <w:numRestart w:val="eachSect"/>

</xml_diff>